<commit_message>
pre check error delete column
</commit_message>
<xml_diff>
--- a/docs/docx/00_INDEX.docx
+++ b/docs/docx/00_INDEX.docx
@@ -1301,7 +1301,7 @@
           <w:b/>
           <w:bCs/>
         </w:rPr>
-        <w:t xml:space="preserve">3.10.696</w:t>
+        <w:t xml:space="preserve">3.10.798</w:t>
       </w:r>
       <w:r>
         <w:t xml:space="preserve">).</w:t>
@@ -1461,7 +1461,7 @@
           <w:b/>
           <w:bCs/>
         </w:rPr>
-        <w:t xml:space="preserve">3.10.711</w:t>
+        <w:t xml:space="preserve">3.10.798</w:t>
       </w:r>
       <w:r>
         <w:t xml:space="preserve">). Синхронизируется по пакету (</w:t>
@@ -1504,13 +1504,13 @@
       </w:r>
     </w:p>
     <w:bookmarkEnd w:id="35"/>
-    <w:bookmarkStart w:id="37" w:name="ключевые-возможности-состояние-3.10.711"/>
+    <w:bookmarkStart w:id="37" w:name="ключевые-возможности-состояние-3.10.798"/>
     <w:p>
       <w:pPr>
         <w:pStyle w:val="Heading2"/>
       </w:pPr>
       <w:r>
-        <w:t xml:space="preserve">Ключевые возможности (состояние 3.10.711)</w:t>
+        <w:t xml:space="preserve">Ключевые возможности (состояние 3.10.798)</w:t>
       </w:r>
     </w:p>
     <w:tbl>
@@ -2237,6 +2237,324 @@
               </w:rPr>
               <w:t xml:space="preserve">15</w:t>
             </w:r>
+          </w:p>
+        </w:tc>
+      </w:tr>
+      <w:tr>
+        <w:tc>
+          <w:tcPr/>
+          <w:p>
+            <w:pPr>
+              <w:pStyle w:val="Compact"/>
+            </w:pPr>
+            <w:r>
+              <w:rPr>
+                <w:rStyle w:val="VerbatimChar"/>
+                <w:b/>
+                <w:bCs/>
+              </w:rPr>
+              <w:t xml:space="preserve">копирование_диапазонов</w:t>
+            </w:r>
+            <w:r>
+              <w:t xml:space="preserve"> </w:t>
+            </w:r>
+            <w:r>
+              <w:t xml:space="preserve">(RANGE / финал)</w:t>
+            </w:r>
+          </w:p>
+        </w:tc>
+        <w:tc>
+          <w:tcPr/>
+          <w:p>
+            <w:pPr>
+              <w:pStyle w:val="Compact"/>
+            </w:pPr>
+            <w:hyperlink r:id="rId16">
+              <w:r>
+                <w:rPr>
+                  <w:rStyle w:val="Hyperlink"/>
+                </w:rPr>
+                <w:t xml:space="preserve">05</w:t>
+              </w:r>
+            </w:hyperlink>
+            <w:r>
+              <w:t xml:space="preserve">,</w:t>
+            </w:r>
+            <w:r>
+              <w:t xml:space="preserve"> </w:t>
+            </w:r>
+            <w:hyperlink r:id="rId29">
+              <w:r>
+                <w:rPr>
+                  <w:rStyle w:val="Hyperlink"/>
+                </w:rPr>
+                <w:t xml:space="preserve">13</w:t>
+              </w:r>
+            </w:hyperlink>
+            <w:r>
+              <w:t xml:space="preserve">,</w:t>
+            </w:r>
+            <w:r>
+              <w:t xml:space="preserve"> </w:t>
+            </w:r>
+            <w:hyperlink r:id="rId18">
+              <w:r>
+                <w:rPr>
+                  <w:rStyle w:val="Hyperlink"/>
+                </w:rPr>
+                <w:t xml:space="preserve">06</w:t>
+              </w:r>
+            </w:hyperlink>
+          </w:p>
+        </w:tc>
+      </w:tr>
+      <w:tr>
+        <w:tc>
+          <w:tcPr/>
+          <w:p>
+            <w:pPr>
+              <w:pStyle w:val="Compact"/>
+            </w:pPr>
+            <w:r>
+              <w:rPr>
+                <w:rStyle w:val="VerbatimChar"/>
+                <w:b/>
+                <w:bCs/>
+              </w:rPr>
+              <w:t xml:space="preserve">развернуть_столбцы</w:t>
+            </w:r>
+            <w:r>
+              <w:t xml:space="preserve">,</w:t>
+            </w:r>
+            <w:r>
+              <w:t xml:space="preserve"> </w:t>
+            </w:r>
+            <w:r>
+              <w:rPr>
+                <w:rStyle w:val="VerbatimChar"/>
+                <w:b/>
+                <w:bCs/>
+              </w:rPr>
+              <w:t xml:space="preserve">заполнить_вверх</w:t>
+            </w:r>
+            <w:r>
+              <w:t xml:space="preserve">, merge-блоки</w:t>
+            </w:r>
+          </w:p>
+        </w:tc>
+        <w:tc>
+          <w:tcPr/>
+          <w:p>
+            <w:pPr>
+              <w:pStyle w:val="Compact"/>
+            </w:pPr>
+            <w:hyperlink r:id="rId16">
+              <w:r>
+                <w:rPr>
+                  <w:rStyle w:val="Hyperlink"/>
+                </w:rPr>
+                <w:t xml:space="preserve">05</w:t>
+              </w:r>
+            </w:hyperlink>
+            <w:r>
+              <w:t xml:space="preserve">,</w:t>
+            </w:r>
+            <w:r>
+              <w:t xml:space="preserve"> </w:t>
+            </w:r>
+            <w:hyperlink r:id="rId29">
+              <w:r>
+                <w:rPr>
+                  <w:rStyle w:val="Hyperlink"/>
+                </w:rPr>
+                <w:t xml:space="preserve">13</w:t>
+              </w:r>
+            </w:hyperlink>
+          </w:p>
+        </w:tc>
+      </w:tr>
+      <w:tr>
+        <w:tc>
+          <w:tcPr/>
+          <w:p>
+            <w:pPr>
+              <w:pStyle w:val="Compact"/>
+            </w:pPr>
+            <w:r>
+              <w:rPr>
+                <w:rStyle w:val="VerbatimChar"/>
+                <w:b/>
+                <w:bCs/>
+              </w:rPr>
+              <w:t xml:space="preserve">создать_лист</w:t>
+            </w:r>
+            <w:r>
+              <w:t xml:space="preserve">,</w:t>
+            </w:r>
+            <w:r>
+              <w:t xml:space="preserve"> </w:t>
+            </w:r>
+            <w:r>
+              <w:rPr>
+                <w:rStyle w:val="VerbatimChar"/>
+                <w:b/>
+                <w:bCs/>
+              </w:rPr>
+              <w:t xml:space="preserve">подготовка_писем</w:t>
+            </w:r>
+            <w:r>
+              <w:t xml:space="preserve"> </w:t>
+            </w:r>
+            <w:r>
+              <w:t xml:space="preserve">(AText)</w:t>
+            </w:r>
+          </w:p>
+        </w:tc>
+        <w:tc>
+          <w:tcPr/>
+          <w:p>
+            <w:pPr>
+              <w:pStyle w:val="Compact"/>
+            </w:pPr>
+            <w:hyperlink r:id="rId16">
+              <w:r>
+                <w:rPr>
+                  <w:rStyle w:val="Hyperlink"/>
+                </w:rPr>
+                <w:t xml:space="preserve">05</w:t>
+              </w:r>
+            </w:hyperlink>
+            <w:r>
+              <w:t xml:space="preserve">,</w:t>
+            </w:r>
+            <w:r>
+              <w:t xml:space="preserve"> </w:t>
+            </w:r>
+            <w:hyperlink r:id="rId29">
+              <w:r>
+                <w:rPr>
+                  <w:rStyle w:val="Hyperlink"/>
+                </w:rPr>
+                <w:t xml:space="preserve">13</w:t>
+              </w:r>
+            </w:hyperlink>
+          </w:p>
+        </w:tc>
+      </w:tr>
+      <w:tr>
+        <w:tc>
+          <w:tcPr/>
+          <w:p>
+            <w:pPr>
+              <w:pStyle w:val="Compact"/>
+            </w:pPr>
+            <w:r>
+              <w:t xml:space="preserve">Визард</w:t>
+            </w:r>
+            <w:r>
+              <w:t xml:space="preserve"> </w:t>
+            </w:r>
+            <w:r>
+              <w:rPr>
+                <w:b/>
+                <w:bCs/>
+              </w:rPr>
+              <w:t xml:space="preserve">«Все параметры»</w:t>
+            </w:r>
+            <w:r>
+              <w:t xml:space="preserve"> </w:t>
+            </w:r>
+            <w:r>
+              <w:t xml:space="preserve">(пайплайн как Power Query)</w:t>
+            </w:r>
+          </w:p>
+        </w:tc>
+        <w:tc>
+          <w:tcPr/>
+          <w:p>
+            <w:pPr>
+              <w:pStyle w:val="Compact"/>
+            </w:pPr>
+            <w:hyperlink r:id="rId18">
+              <w:r>
+                <w:rPr>
+                  <w:rStyle w:val="Hyperlink"/>
+                </w:rPr>
+                <w:t xml:space="preserve">06</w:t>
+              </w:r>
+            </w:hyperlink>
+          </w:p>
+        </w:tc>
+      </w:tr>
+      <w:tr>
+        <w:tc>
+          <w:tcPr/>
+          <w:p>
+            <w:pPr>
+              <w:pStyle w:val="Compact"/>
+            </w:pPr>
+            <w:r>
+              <w:t xml:space="preserve">Переименование</w:t>
+            </w:r>
+            <w:r>
+              <w:t xml:space="preserve"> </w:t>
+            </w:r>
+            <w:r>
+              <w:rPr>
+                <w:rStyle w:val="VerbatimChar"/>
+                <w:b/>
+                <w:bCs/>
+              </w:rPr>
+              <w:t xml:space="preserve">копировать_как_значения</w:t>
+            </w:r>
+            <w:r>
+              <w:t xml:space="preserve"> </w:t>
+            </w:r>
+            <w:r>
+              <w:t xml:space="preserve">(было</w:t>
+            </w:r>
+            <w:r>
+              <w:t xml:space="preserve"> </w:t>
+            </w:r>
+            <w:r>
+              <w:rPr>
+                <w:rStyle w:val="VerbatimChar"/>
+              </w:rPr>
+              <w:t xml:space="preserve">копировать_как_значения</w:t>
+            </w:r>
+            <w:r>
+              <w:t xml:space="preserve">)</w:t>
+            </w:r>
+          </w:p>
+        </w:tc>
+        <w:tc>
+          <w:tcPr/>
+          <w:p>
+            <w:pPr>
+              <w:pStyle w:val="Compact"/>
+            </w:pPr>
+            <w:hyperlink r:id="rId29">
+              <w:r>
+                <w:rPr>
+                  <w:rStyle w:val="Hyperlink"/>
+                </w:rPr>
+                <w:t xml:space="preserve">13</w:t>
+              </w:r>
+            </w:hyperlink>
+            <w:r>
+              <w:t xml:space="preserve">,</w:t>
+            </w:r>
+            <w:r>
+              <w:t xml:space="preserve"> </w:t>
+            </w:r>
+            <w:hyperlink r:id="rId13">
+              <w:r>
+                <w:rPr>
+                  <w:rStyle w:val="Hyperlink"/>
+                </w:rPr>
+                <w:t xml:space="preserve">15</w:t>
+              </w:r>
+            </w:hyperlink>
           </w:p>
         </w:tc>
       </w:tr>

</xml_diff>